<commit_message>
docs: speaker notes on every slide, simpler hooks section, worktree clean-up
- Deck (82 slides): speaker notes on all slides; hooks cut to four slides
  (non-optional, before or after, two we wire today, two things that will
  catch you); new "closing it off: merge, then clean up" worktree slide;
  stale lines fixed; passes the pptx skill validator against the original
- Speaker notes v3.md: the same notes, readable outside PowerPoint
- Handbook: worktree merge and clean-up commands, "Hooks in one minute"

Co-Authored-By: Claude Opus 5.5 <noreply@anthropic.com>
</commit_message>
<xml_diff>
--- a/docs/TCA Student Handbook V2.docx
+++ b/docs/TCA Student Handbook V2.docx
@@ -5571,6 +5571,337 @@
       </w:r>
     </w:p>
     <w:p>
+      <w:pPr>
+        <w:pStyle w:val="Heading3"/>
+        <w:spacing w:before="200" w:after="80"/>
+      </w:pPr>
+      <w:r>
+        <w:t xml:space="preserve">Closing it off: merge, then clean up</w:t>
+      </w:r>
+    </w:p>
+    <w:p>
+      <w:pPr>
+        <w:spacing w:after="140" w:line="276" w:lineRule="auto"/>
+      </w:pPr>
+      <w:r>
+        <w:t xml:space="preserve">You picked a winner. Merge it, prove main is still green, then remove both checkouts and their branches. In this order:</w:t>
+      </w:r>
+    </w:p>
+    <w:p>
+      <w:pPr>
+        <w:keepNext/>
+        <w:keepLines/>
+        <w:spacing w:before="160" w:after="20"/>
+      </w:pPr>
+      <w:r>
+        <w:rPr>
+          <w:b/>
+          <w:bCs/>
+          <w:caps/>
+          <w:color w:val="6E6E7A"/>
+          <w:spacing w:val="6"/>
+          <w:sz w:val="16"/>
+          <w:szCs w:val="16"/>
+        </w:rPr>
+        <w:t>Terminal</w:t>
+      </w:r>
+    </w:p>
+    <w:tbl>
+      <w:tblPr>
+        <w:tblStyle w:val="TableNormal0"/>
+        <w:tblW w:w="9360" w:type="dxa"/>
+        <w:tblInd w:w="0" w:type="dxa"/>
+        <w:tblBorders>
+          <w:top w:val="single" w:sz="4" w:space="0" w:color="E4E1EC"/>
+          <w:left w:val="single" w:sz="24" w:space="0" w:color="5E02D1"/>
+          <w:bottom w:val="single" w:sz="4" w:space="0" w:color="E4E1EC"/>
+          <w:right w:val="single" w:sz="4" w:space="0" w:color="E4E1EC"/>
+        </w:tblBorders>
+        <w:tblLayout w:type="fixed"/>
+        <w:tblCellMar>
+          <w:top w:w="140" w:type="dxa"/>
+          <w:left w:w="200" w:type="dxa"/>
+          <w:bottom w:w="140" w:type="dxa"/>
+          <w:right w:w="160" w:type="dxa"/>
+        </w:tblCellMar>
+        <w:tblLook w:val="04A0" w:firstRow="1" w:lastRow="0" w:firstColumn="1" w:lastColumn="0" w:noHBand="0" w:noVBand="1"/>
+      </w:tblPr>
+      <w:tblGrid>
+        <w:gridCol w:w="9360"/>
+      </w:tblGrid>
+      <w:tr>
+        <w:tc>
+          <w:tcPr>
+            <w:tcW w:w="9360" w:type="dxa"/>
+            <w:shd w:val="clear" w:color="auto" w:fill="F7F6FB"/>
+          </w:tcPr>
+          <w:p>
+            <w:pPr>
+              <w:keepNext/>
+              <w:keepLines/>
+              <w:spacing w:line="264" w:lineRule="auto"/>
+              <w:ind w:left="120"/>
+            </w:pPr>
+            <w:r>
+              <w:rPr>
+                <w:rFonts w:ascii="Consolas" w:hAnsi="Consolas" w:cs="Consolas"/>
+                <w:sz w:val="18"/>
+                <w:szCs w:val="18"/>
+              </w:rPr>
+              <w:t xml:space="preserve">git switch main</w:t>
+            </w:r>
+            <w:r>
+              <w:rPr>
+                <w:rFonts w:ascii="Consolas" w:hAnsi="Consolas" w:cs="Consolas"/>
+                <w:sz w:val="18"/>
+                <w:szCs w:val="18"/>
+              </w:rPr>
+              <w:br/>
+              <w:t xml:space="preserve">git diff main worktree-ring-a --stat      # last look at the winner</w:t>
+            </w:r>
+            <w:r>
+              <w:rPr>
+                <w:rFonts w:ascii="Consolas" w:hAnsi="Consolas" w:cs="Consolas"/>
+                <w:sz w:val="18"/>
+                <w:szCs w:val="18"/>
+              </w:rPr>
+              <w:br/>
+              <w:t xml:space="preserve">git merge worktree-ring-a                 # or: git cherry-pick &lt;sha&gt; for one good commit</w:t>
+            </w:r>
+            <w:r>
+              <w:rPr>
+                <w:rFonts w:ascii="Consolas" w:hAnsi="Consolas" w:cs="Consolas"/>
+                <w:sz w:val="18"/>
+                <w:szCs w:val="18"/>
+              </w:rPr>
+              <w:br/>
+              <w:t xml:space="preserve">make check                                # still green on main?</w:t>
+            </w:r>
+            <w:r>
+              <w:rPr>
+                <w:rFonts w:ascii="Consolas" w:hAnsi="Consolas" w:cs="Consolas"/>
+                <w:sz w:val="18"/>
+                <w:szCs w:val="18"/>
+              </w:rPr>
+              <w:br/>
+              <w:t xml:space="preserve">git worktree remove .claude/worktrees/ring-a</w:t>
+            </w:r>
+            <w:r>
+              <w:rPr>
+                <w:rFonts w:ascii="Consolas" w:hAnsi="Consolas" w:cs="Consolas"/>
+                <w:sz w:val="18"/>
+                <w:szCs w:val="18"/>
+              </w:rPr>
+              <w:br/>
+              <w:t xml:space="preserve">git worktree remove --force .claude/worktrees/ring-b   # the loser; drops its changes</w:t>
+            </w:r>
+            <w:r>
+              <w:rPr>
+                <w:rFonts w:ascii="Consolas" w:hAnsi="Consolas" w:cs="Consolas"/>
+                <w:sz w:val="18"/>
+                <w:szCs w:val="18"/>
+              </w:rPr>
+              <w:br/>
+              <w:t xml:space="preserve">git branch -d worktree-ring-a             # merged, so -d is safe</w:t>
+            </w:r>
+            <w:r>
+              <w:rPr>
+                <w:rFonts w:ascii="Consolas" w:hAnsi="Consolas" w:cs="Consolas"/>
+                <w:sz w:val="18"/>
+                <w:szCs w:val="18"/>
+              </w:rPr>
+              <w:br/>
+              <w:t xml:space="preserve">git branch -D worktree-ring-b             # never merged: -D throws it away</w:t>
+            </w:r>
+            <w:r>
+              <w:rPr>
+                <w:rFonts w:ascii="Consolas" w:hAnsi="Consolas" w:cs="Consolas"/>
+                <w:sz w:val="18"/>
+                <w:szCs w:val="18"/>
+              </w:rPr>
+              <w:br/>
+              <w:t xml:space="preserve">git worktree prune                        # forget folders deleted by hand</w:t>
+            </w:r>
+            <w:r>
+              <w:rPr>
+                <w:rFonts w:ascii="Consolas" w:hAnsi="Consolas" w:cs="Consolas"/>
+                <w:sz w:val="18"/>
+                <w:szCs w:val="18"/>
+              </w:rPr>
+              <w:br/>
+              <w:t xml:space="preserve">git worktree list                         # should show only main</w:t>
+            </w:r>
+          </w:p>
+        </w:tc>
+      </w:tr>
+    </w:tbl>
+    <w:p>
+      <w:pPr>
+        <w:spacing w:after="120" w:line="120" w:lineRule="auto"/>
+      </w:pPr>
+    </w:p>
+    <w:p>
+      <w:pPr>
+        <w:pStyle w:val="ListBullet"/>
+        <w:spacing w:after="60" w:line="276" w:lineRule="auto"/>
+      </w:pPr>
+      <w:r>
+        <w:rPr>
+          <w:b/>
+          <w:bCs/>
+        </w:rPr>
+        <w:t xml:space="preserve">Git says no twice, on purpose.</w:t>
+      </w:r>
+      <w:r>
+        <w:t xml:space="preserve"> It refuses to remove a worktree with uncommitted changes, and refuses </w:t>
+      </w:r>
+      <w:r>
+        <w:rPr>
+          <w:rFonts w:ascii="Consolas" w:hAnsi="Consolas" w:cs="Consolas"/>
+          <w:sz w:val="20"/>
+          <w:szCs w:val="20"/>
+        </w:rPr>
+        <w:t xml:space="preserve">-d</w:t>
+      </w:r>
+      <w:r>
+        <w:t xml:space="preserve"> on a branch that was never merged. Both refusals are the safety net working: read them before you reach for </w:t>
+      </w:r>
+      <w:r>
+        <w:rPr>
+          <w:rFonts w:ascii="Consolas" w:hAnsi="Consolas" w:cs="Consolas"/>
+          <w:sz w:val="20"/>
+          <w:szCs w:val="20"/>
+        </w:rPr>
+        <w:t xml:space="preserve">--force</w:t>
+      </w:r>
+      <w:r>
+        <w:t xml:space="preserve"> or </w:t>
+      </w:r>
+      <w:r>
+        <w:rPr>
+          <w:rFonts w:ascii="Consolas" w:hAnsi="Consolas" w:cs="Consolas"/>
+          <w:sz w:val="20"/>
+          <w:szCs w:val="20"/>
+        </w:rPr>
+        <w:t xml:space="preserve">-D</w:t>
+      </w:r>
+      <w:r>
+        <w:t xml:space="preserve">.</w:t>
+      </w:r>
+    </w:p>
+    <w:p>
+      <w:pPr>
+        <w:pStyle w:val="ListBullet"/>
+        <w:spacing w:after="60" w:line="276" w:lineRule="auto"/>
+      </w:pPr>
+      <w:r>
+        <w:rPr>
+          <w:b/>
+          <w:bCs/>
+        </w:rPr>
+        <w:t xml:space="preserve">Exiting a </w:t>
+      </w:r>
+      <w:r>
+        <w:rPr>
+          <w:rFonts w:ascii="Consolas" w:hAnsi="Consolas" w:cs="Consolas"/>
+          <w:b/>
+          <w:bCs/>
+          <w:sz w:val="20"/>
+          <w:szCs w:val="20"/>
+        </w:rPr>
+        <w:t xml:space="preserve">claude -w</w:t>
+      </w:r>
+      <w:r>
+        <w:rPr>
+          <w:b/>
+          <w:bCs/>
+        </w:rPr>
+        <w:t xml:space="preserve"> session offers to remove its worktree for you</w:t>
+      </w:r>
+      <w:r>
+        <w:t xml:space="preserve">, so often the remove step is already done.</w:t>
+      </w:r>
+    </w:p>
+    <w:p>
+      <w:pPr>
+        <w:pStyle w:val="ListBullet"/>
+        <w:spacing w:after="60" w:line="276" w:lineRule="auto"/>
+      </w:pPr>
+      <w:r>
+        <w:rPr>
+          <w:b/>
+          <w:bCs/>
+        </w:rPr>
+        <w:t xml:space="preserve">At work, prefer a pull request to a local merge:</w:t>
+      </w:r>
+      <w:r>
+        <w:t xml:space="preserve"> </w:t>
+      </w:r>
+      <w:r>
+        <w:rPr>
+          <w:rFonts w:ascii="Consolas" w:hAnsi="Consolas" w:cs="Consolas"/>
+          <w:sz w:val="20"/>
+          <w:szCs w:val="20"/>
+        </w:rPr>
+        <w:t xml:space="preserve">git push -u origin worktree-ring-a</w:t>
+      </w:r>
+      <w:r>
+        <w:t xml:space="preserve">, then </w:t>
+      </w:r>
+      <w:r>
+        <w:rPr>
+          <w:rFonts w:ascii="Consolas" w:hAnsi="Consolas" w:cs="Consolas"/>
+          <w:sz w:val="20"/>
+          <w:szCs w:val="20"/>
+        </w:rPr>
+        <w:t xml:space="preserve">gh pr create --fill</w:t>
+      </w:r>
+      <w:r>
+        <w:t xml:space="preserve">.</w:t>
+      </w:r>
+    </w:p>
+    <w:p>
+      <w:pPr>
+        <w:spacing w:after="140" w:line="276" w:lineRule="auto"/>
+      </w:pPr>
+      <w:r>
+        <w:t xml:space="preserve">Made the worktrees by hand (</w:t>
+      </w:r>
+      <w:r>
+        <w:rPr>
+          <w:rFonts w:ascii="Consolas" w:hAnsi="Consolas" w:cs="Consolas"/>
+          <w:sz w:val="20"/>
+          <w:szCs w:val="20"/>
+        </w:rPr>
+        <w:t xml:space="preserve">git worktree add ../ring-b -b ring-b</w:t>
+      </w:r>
+      <w:r>
+        <w:t xml:space="preserve">)? Same commands, with the path </w:t>
+      </w:r>
+      <w:r>
+        <w:rPr>
+          <w:rFonts w:ascii="Consolas" w:hAnsi="Consolas" w:cs="Consolas"/>
+          <w:sz w:val="20"/>
+          <w:szCs w:val="20"/>
+        </w:rPr>
+        <w:t xml:space="preserve">../ring-b</w:t>
+      </w:r>
+      <w:r>
+        <w:t xml:space="preserve"> and the branch </w:t>
+      </w:r>
+      <w:r>
+        <w:rPr>
+          <w:rFonts w:ascii="Consolas" w:hAnsi="Consolas" w:cs="Consolas"/>
+          <w:sz w:val="20"/>
+          <w:szCs w:val="20"/>
+        </w:rPr>
+        <w:t xml:space="preserve">ring-b</w:t>
+      </w:r>
+      <w:r>
+        <w:t xml:space="preserve">.</w:t>
+      </w:r>
+    </w:p>
+    <w:p>
       <w:r>
         <w:br w:type="page"/>
       </w:r>
@@ -10250,6 +10581,410 @@
         <w:spacing w:before="200" w:after="80"/>
       </w:pPr>
       <w:r>
+        <w:t xml:space="preserve">Hooks in one minute</w:t>
+      </w:r>
+    </w:p>
+    <w:p>
+      <w:pPr>
+        <w:spacing w:after="140" w:line="276" w:lineRule="auto"/>
+      </w:pPr>
+      <w:r>
+        <w:t xml:space="preserve">A hook is a script the tool runs automatically, every time, either </w:t>
+      </w:r>
+      <w:r>
+        <w:rPr>
+          <w:b/>
+          <w:bCs/>
+        </w:rPr>
+        <w:t xml:space="preserve">before</w:t>
+      </w:r>
+      <w:r>
+        <w:t xml:space="preserve"> or </w:t>
+      </w:r>
+      <w:r>
+        <w:rPr>
+          <w:b/>
+          <w:bCs/>
+        </w:rPr>
+        <w:t xml:space="preserve">after</w:t>
+      </w:r>
+      <w:r>
+        <w:t xml:space="preserve"> something the agent does. That is the whole idea; you do not need the full list of events.</w:t>
+      </w:r>
+    </w:p>
+    <w:tbl>
+      <w:tblPr>
+        <w:tblStyle w:val="TableNormal0"/>
+        <w:tblW w:w="9360" w:type="dxa"/>
+        <w:tblInd w:w="0" w:type="dxa"/>
+        <w:tblBorders>
+          <w:top w:val="single" w:sz="4" w:space="0" w:color="D9CCEF"/>
+          <w:left w:val="single" w:sz="4" w:space="0" w:color="D9CCEF"/>
+          <w:bottom w:val="single" w:sz="4" w:space="0" w:color="D9CCEF"/>
+          <w:right w:val="single" w:sz="4" w:space="0" w:color="D9CCEF"/>
+          <w:insideH w:val="single" w:sz="4" w:space="0" w:color="D9CCEF"/>
+          <w:insideV w:val="single" w:sz="4" w:space="0" w:color="D9CCEF"/>
+        </w:tblBorders>
+        <w:tblLayout w:type="fixed"/>
+        <w:tblLook w:val="04A0" w:firstRow="1" w:lastRow="0" w:firstColumn="1" w:lastColumn="0" w:noHBand="0" w:noVBand="1"/>
+      </w:tblPr>
+      <w:tblGrid>
+        <w:gridCol w:w="2000"/>
+        <w:gridCol w:w="3000"/>
+        <w:gridCol w:w="4360"/>
+      </w:tblGrid>
+      <w:tr>
+        <w:trPr>
+          <w:tblHeader/>
+        </w:trPr>
+        <w:tc>
+          <w:tcPr>
+            <w:tcW w:w="2000" w:type="dxa"/>
+            <w:shd w:val="clear" w:color="auto" w:fill="5E02D1"/>
+          </w:tcPr>
+          <w:p>
+            <w:pPr>
+              <w:spacing w:before="40" w:after="40" w:line="252" w:lineRule="auto"/>
+            </w:pPr>
+            <w:r>
+              <w:rPr>
+                <w:b/>
+                <w:bCs/>
+                <w:color w:val="FFFFFF"/>
+                <w:sz w:val="18"/>
+                <w:szCs w:val="18"/>
+              </w:rPr>
+              <w:t xml:space="preserve">When</w:t>
+            </w:r>
+          </w:p>
+        </w:tc>
+        <w:tc>
+          <w:tcPr>
+            <w:tcW w:w="3000" w:type="dxa"/>
+            <w:shd w:val="clear" w:color="auto" w:fill="5E02D1"/>
+          </w:tcPr>
+          <w:p>
+            <w:pPr>
+              <w:spacing w:before="40" w:after="40" w:line="252" w:lineRule="auto"/>
+            </w:pPr>
+            <w:r>
+              <w:rPr>
+                <w:b/>
+                <w:bCs/>
+                <w:color w:val="FFFFFF"/>
+                <w:sz w:val="18"/>
+                <w:szCs w:val="18"/>
+              </w:rPr>
+              <w:t xml:space="preserve">What it is for</w:t>
+            </w:r>
+          </w:p>
+        </w:tc>
+        <w:tc>
+          <w:tcPr>
+            <w:tcW w:w="4360" w:type="dxa"/>
+            <w:shd w:val="clear" w:color="auto" w:fill="5E02D1"/>
+          </w:tcPr>
+          <w:p>
+            <w:pPr>
+              <w:spacing w:before="40" w:after="40" w:line="252" w:lineRule="auto"/>
+            </w:pPr>
+            <w:r>
+              <w:rPr>
+                <w:b/>
+                <w:bCs/>
+                <w:color w:val="FFFFFF"/>
+                <w:sz w:val="18"/>
+                <w:szCs w:val="18"/>
+              </w:rPr>
+              <w:t xml:space="preserve">Today's example</w:t>
+            </w:r>
+          </w:p>
+        </w:tc>
+      </w:tr>
+      <w:tr>
+        <w:trPr>
+          <w:cantSplit/>
+        </w:trPr>
+        <w:tc>
+          <w:tcPr>
+            <w:tcW w:w="2000" w:type="dxa"/>
+            <w:shd w:val="clear" w:color="auto" w:fill="F5F0FF"/>
+          </w:tcPr>
+          <w:p>
+            <w:pPr>
+              <w:spacing w:before="40" w:after="40" w:line="252" w:lineRule="auto"/>
+            </w:pPr>
+            <w:r>
+              <w:rPr>
+                <w:b/>
+                <w:bCs/>
+                <w:sz w:val="18"/>
+                <w:szCs w:val="18"/>
+              </w:rPr>
+              <w:t xml:space="preserve">Before</w:t>
+            </w:r>
+            <w:r>
+              <w:rPr>
+                <w:sz w:val="18"/>
+                <w:szCs w:val="18"/>
+              </w:rPr>
+              <w:t xml:space="preserve"> the agent acts</w:t>
+            </w:r>
+          </w:p>
+        </w:tc>
+        <w:tc>
+          <w:tcPr>
+            <w:tcW w:w="3000" w:type="dxa"/>
+            <w:shd w:val="clear" w:color="auto" w:fill="F5F0FF"/>
+          </w:tcPr>
+          <w:p>
+            <w:pPr>
+              <w:spacing w:before="40" w:after="40" w:line="252" w:lineRule="auto"/>
+            </w:pPr>
+            <w:r>
+              <w:rPr>
+                <w:sz w:val="18"/>
+                <w:szCs w:val="18"/>
+              </w:rPr>
+              <w:t xml:space="preserve">Check it, and stop it if it is wrong</w:t>
+            </w:r>
+          </w:p>
+        </w:tc>
+        <w:tc>
+          <w:tcPr>
+            <w:tcW w:w="4360" w:type="dxa"/>
+            <w:shd w:val="clear" w:color="auto" w:fill="F5F0FF"/>
+          </w:tcPr>
+          <w:p>
+            <w:pPr>
+              <w:spacing w:before="40" w:after="40" w:line="252" w:lineRule="auto"/>
+            </w:pPr>
+            <w:r>
+              <w:rPr>
+                <w:sz w:val="18"/>
+                <w:szCs w:val="18"/>
+              </w:rPr>
+              <w:t xml:space="preserve">Block an edit to the streak logic unless a test changed too (</w:t>
+            </w:r>
+            <w:r>
+              <w:rPr>
+                <w:rFonts w:ascii="Consolas" w:hAnsi="Consolas" w:cs="Consolas"/>
+                <w:sz w:val="18"/>
+                <w:szCs w:val="18"/>
+              </w:rPr>
+              <w:t xml:space="preserve">PreToolUse</w:t>
+            </w:r>
+            <w:r>
+              <w:rPr>
+                <w:sz w:val="18"/>
+                <w:szCs w:val="18"/>
+              </w:rPr>
+              <w:t xml:space="preserve">)</w:t>
+            </w:r>
+          </w:p>
+        </w:tc>
+      </w:tr>
+      <w:tr>
+        <w:trPr>
+          <w:cantSplit/>
+        </w:trPr>
+        <w:tc>
+          <w:tcPr>
+            <w:tcW w:w="2000" w:type="dxa"/>
+            <w:shd w:val="clear" w:color="auto" w:fill="FFFFFF"/>
+          </w:tcPr>
+          <w:p>
+            <w:pPr>
+              <w:spacing w:before="40" w:after="40" w:line="252" w:lineRule="auto"/>
+            </w:pPr>
+            <w:r>
+              <w:rPr>
+                <w:b/>
+                <w:bCs/>
+                <w:sz w:val="18"/>
+                <w:szCs w:val="18"/>
+              </w:rPr>
+              <w:t xml:space="preserve">After</w:t>
+            </w:r>
+            <w:r>
+              <w:rPr>
+                <w:sz w:val="18"/>
+                <w:szCs w:val="18"/>
+              </w:rPr>
+              <w:t xml:space="preserve"> the agent acts</w:t>
+            </w:r>
+          </w:p>
+        </w:tc>
+        <w:tc>
+          <w:tcPr>
+            <w:tcW w:w="3000" w:type="dxa"/>
+            <w:shd w:val="clear" w:color="auto" w:fill="FFFFFF"/>
+          </w:tcPr>
+          <w:p>
+            <w:pPr>
+              <w:spacing w:before="40" w:after="40" w:line="252" w:lineRule="auto"/>
+            </w:pPr>
+            <w:r>
+              <w:rPr>
+                <w:sz w:val="18"/>
+                <w:szCs w:val="18"/>
+              </w:rPr>
+              <w:t xml:space="preserve">Tidy up, or check the result</w:t>
+            </w:r>
+          </w:p>
+        </w:tc>
+        <w:tc>
+          <w:tcPr>
+            <w:tcW w:w="4360" w:type="dxa"/>
+            <w:shd w:val="clear" w:color="auto" w:fill="FFFFFF"/>
+          </w:tcPr>
+          <w:p>
+            <w:pPr>
+              <w:spacing w:before="40" w:after="40" w:line="252" w:lineRule="auto"/>
+            </w:pPr>
+            <w:r>
+              <w:rPr>
+                <w:sz w:val="18"/>
+                <w:szCs w:val="18"/>
+              </w:rPr>
+              <w:t xml:space="preserve">Format the file just written (</w:t>
+            </w:r>
+            <w:r>
+              <w:rPr>
+                <w:rFonts w:ascii="Consolas" w:hAnsi="Consolas" w:cs="Consolas"/>
+                <w:sz w:val="18"/>
+                <w:szCs w:val="18"/>
+              </w:rPr>
+              <w:t xml:space="preserve">PostToolUse</w:t>
+            </w:r>
+            <w:r>
+              <w:rPr>
+                <w:sz w:val="18"/>
+                <w:szCs w:val="18"/>
+              </w:rPr>
+              <w:t xml:space="preserve">); run </w:t>
+            </w:r>
+            <w:r>
+              <w:rPr>
+                <w:rFonts w:ascii="Consolas" w:hAnsi="Consolas" w:cs="Consolas"/>
+                <w:sz w:val="18"/>
+                <w:szCs w:val="18"/>
+              </w:rPr>
+              <w:t xml:space="preserve">make check</w:t>
+            </w:r>
+            <w:r>
+              <w:rPr>
+                <w:sz w:val="18"/>
+                <w:szCs w:val="18"/>
+              </w:rPr>
+              <w:t xml:space="preserve"> when it says it is done, and send it back if red (</w:t>
+            </w:r>
+            <w:r>
+              <w:rPr>
+                <w:rFonts w:ascii="Consolas" w:hAnsi="Consolas" w:cs="Consolas"/>
+                <w:sz w:val="18"/>
+                <w:szCs w:val="18"/>
+              </w:rPr>
+              <w:t xml:space="preserve">Stop</w:t>
+            </w:r>
+            <w:r>
+              <w:rPr>
+                <w:sz w:val="18"/>
+                <w:szCs w:val="18"/>
+              </w:rPr>
+              <w:t xml:space="preserve">)</w:t>
+            </w:r>
+          </w:p>
+        </w:tc>
+      </w:tr>
+    </w:tbl>
+    <w:p>
+      <w:pPr>
+        <w:spacing w:after="120" w:line="120" w:lineRule="auto"/>
+      </w:pPr>
+    </w:p>
+    <w:p>
+      <w:pPr>
+        <w:pStyle w:val="ListBullet"/>
+        <w:spacing w:after="60" w:line="276" w:lineRule="auto"/>
+      </w:pPr>
+      <w:r>
+        <w:rPr>
+          <w:b/>
+          <w:bCs/>
+        </w:rPr>
+        <w:t xml:space="preserve">Exit codes decide.</w:t>
+      </w:r>
+      <w:r>
+        <w:t xml:space="preserve"> </w:t>
+      </w:r>
+      <w:r>
+        <w:rPr>
+          <w:rFonts w:ascii="Consolas" w:hAnsi="Consolas" w:cs="Consolas"/>
+          <w:sz w:val="20"/>
+          <w:szCs w:val="20"/>
+        </w:rPr>
+        <w:t xml:space="preserve">0</w:t>
+      </w:r>
+      <w:r>
+        <w:t xml:space="preserve"> carry on. </w:t>
+      </w:r>
+      <w:r>
+        <w:rPr>
+          <w:rFonts w:ascii="Consolas" w:hAnsi="Consolas" w:cs="Consolas"/>
+          <w:sz w:val="20"/>
+          <w:szCs w:val="20"/>
+        </w:rPr>
+        <w:t xml:space="preserve">2</w:t>
+      </w:r>
+      <w:r>
+        <w:t xml:space="preserve"> block, and stderr goes back to the agent as the reason. </w:t>
+      </w:r>
+      <w:r>
+        <w:rPr>
+          <w:rFonts w:ascii="Consolas" w:hAnsi="Consolas" w:cs="Consolas"/>
+          <w:sz w:val="20"/>
+          <w:szCs w:val="20"/>
+        </w:rPr>
+        <w:t xml:space="preserve">1</w:t>
+      </w:r>
+      <w:r>
+        <w:t xml:space="preserve"> enforces nothing: the action goes ahead.</w:t>
+      </w:r>
+    </w:p>
+    <w:p>
+      <w:pPr>
+        <w:pStyle w:val="ListBullet"/>
+        <w:spacing w:after="60" w:line="276" w:lineRule="auto"/>
+      </w:pPr>
+      <w:r>
+        <w:rPr>
+          <w:b/>
+          <w:bCs/>
+        </w:rPr>
+        <w:t xml:space="preserve">Hooks run in the agent's current directory.</w:t>
+      </w:r>
+      <w:r>
+        <w:t xml:space="preserve"> Find the repo root with </w:t>
+      </w:r>
+      <w:r>
+        <w:rPr>
+          <w:rFonts w:ascii="Consolas" w:hAnsi="Consolas" w:cs="Consolas"/>
+          <w:sz w:val="20"/>
+          <w:szCs w:val="20"/>
+        </w:rPr>
+        <w:t xml:space="preserve">git rev-parse --show-toplevel</w:t>
+      </w:r>
+      <w:r>
+        <w:t xml:space="preserve"> rather than assuming it.</w:t>
+      </w:r>
+    </w:p>
+    <w:p>
+      <w:pPr>
+        <w:pStyle w:val="Heading3"/>
+        <w:spacing w:before="200" w:after="80"/>
+      </w:pPr>
+      <w:r>
         <w:t xml:space="preserve">Block D · lock it in (10 min)</w:t>
       </w:r>
     </w:p>
@@ -10384,7 +11119,7 @@
         <w:spacing w:after="140" w:line="276" w:lineRule="auto"/>
       </w:pPr>
       <w:r>
-        <w:t xml:space="preserve">Hooks run in the agent's current directory. A hook that assumes the repo root breaks the first time the agent runs </w:t>
+        <w:t xml:space="preserve">A hook that assumes the repo root breaks the first time the agent runs </w:t>
       </w:r>
       <w:r>
         <w:rPr>

</xml_diff>